<commit_message>
modified:   Isolation/Editfile.rou.xml 	modified:   Isolation/gui_settings.xml 	modified:   PPT's/Final Observations.docx 	new file:   PPT's/Observation table By vehicle count.pdf 	new file:   PPT's/Observation table.xlsx 	new file:   PPT's/PCU information.pdf
</commit_message>
<xml_diff>
--- a/PPT's/Final Observations.docx
+++ b/PPT's/Final Observations.docx
@@ -730,27 +730,7 @@
           <w:sz w:val="28"/>
           <w:szCs w:val="28"/>
         </w:rPr>
-        <w:t xml:space="preserve">Observation </w:t>
-      </w:r>
-      <w:proofErr w:type="gramStart"/>
-      <w:r>
-        <w:rPr>
-          <w:b/>
-          <w:bCs/>
-          <w:sz w:val="28"/>
-          <w:szCs w:val="28"/>
-        </w:rPr>
-        <w:t>Table :</w:t>
-      </w:r>
-      <w:proofErr w:type="gramEnd"/>
-      <w:r>
-        <w:rPr>
-          <w:b/>
-          <w:bCs/>
-          <w:sz w:val="28"/>
-          <w:szCs w:val="28"/>
-        </w:rPr>
-        <w:t xml:space="preserve"> </w:t>
+        <w:t xml:space="preserve">Observation Table : </w:t>
       </w:r>
     </w:p>
     <w:p>
@@ -2835,6 +2815,108 @@
       </w:tr>
       <w:tr>
         <w:trPr>
+          <w:trHeight w:val="290"/>
+          <w:jc w:val="center"/>
+        </w:trPr>
+        <w:tc>
+          <w:tcPr>
+            <w:tcW w:w="2046" w:type="dxa"/>
+          </w:tcPr>
+          <w:p>
+            <w:pPr>
+              <w:ind w:right="44"/>
+              <w:jc w:val="center"/>
+              <w:rPr>
+                <w:rFonts w:eastAsia="Calibri" w:cstheme="minorHAnsi"/>
+                <w:sz w:val="28"/>
+                <w:szCs w:val="28"/>
+              </w:rPr>
+            </w:pPr>
+            <w:r>
+              <w:rPr>
+                <w:rFonts w:eastAsia="Calibri" w:cstheme="minorHAnsi"/>
+                <w:sz w:val="28"/>
+                <w:szCs w:val="28"/>
+              </w:rPr>
+              <w:t>Case - 20</w:t>
+            </w:r>
+          </w:p>
+        </w:tc>
+        <w:tc>
+          <w:tcPr>
+            <w:tcW w:w="2045" w:type="dxa"/>
+          </w:tcPr>
+          <w:p>
+            <w:pPr>
+              <w:ind w:right="43"/>
+              <w:jc w:val="center"/>
+              <w:rPr>
+                <w:rFonts w:eastAsia="Calibri" w:cstheme="minorHAnsi"/>
+                <w:sz w:val="28"/>
+                <w:szCs w:val="28"/>
+              </w:rPr>
+            </w:pPr>
+            <w:r>
+              <w:rPr>
+                <w:rFonts w:eastAsia="Calibri" w:cstheme="minorHAnsi"/>
+                <w:sz w:val="28"/>
+                <w:szCs w:val="28"/>
+              </w:rPr>
+              <w:t>126</w:t>
+            </w:r>
+          </w:p>
+        </w:tc>
+        <w:tc>
+          <w:tcPr>
+            <w:tcW w:w="2045" w:type="dxa"/>
+          </w:tcPr>
+          <w:p>
+            <w:pPr>
+              <w:ind w:right="44"/>
+              <w:jc w:val="center"/>
+              <w:rPr>
+                <w:rFonts w:eastAsia="Calibri" w:cstheme="minorHAnsi"/>
+                <w:sz w:val="28"/>
+                <w:szCs w:val="28"/>
+              </w:rPr>
+            </w:pPr>
+            <w:r>
+              <w:rPr>
+                <w:rFonts w:eastAsia="Calibri" w:cstheme="minorHAnsi"/>
+                <w:sz w:val="28"/>
+                <w:szCs w:val="28"/>
+              </w:rPr>
+              <w:t>160</w:t>
+            </w:r>
+          </w:p>
+        </w:tc>
+        <w:tc>
+          <w:tcPr>
+            <w:tcW w:w="2151" w:type="dxa"/>
+          </w:tcPr>
+          <w:p>
+            <w:pPr>
+              <w:ind w:right="43"/>
+              <w:jc w:val="center"/>
+              <w:rPr>
+                <w:rFonts w:eastAsia="Calibri" w:cstheme="minorHAnsi"/>
+                <w:sz w:val="28"/>
+                <w:szCs w:val="28"/>
+              </w:rPr>
+            </w:pPr>
+            <w:r>
+              <w:rPr>
+                <w:rFonts w:eastAsia="Calibri" w:cstheme="minorHAnsi"/>
+                <w:sz w:val="28"/>
+                <w:szCs w:val="28"/>
+              </w:rPr>
+              <w:t>-26.98</w:t>
+            </w:r>
+          </w:p>
+        </w:tc>
+      </w:tr>
+      <w:tr>
+        <w:trPr>
           <w:trHeight w:val="581"/>
           <w:jc w:val="center"/>
         </w:trPr>
@@ -2867,23 +2949,13 @@
                 <w:szCs w:val="28"/>
               </w:rPr>
             </w:pPr>
-            <w:proofErr w:type="spellStart"/>
-            <w:r>
-              <w:rPr>
-                <w:rFonts w:eastAsia="Calibri" w:cstheme="minorHAnsi"/>
-                <w:sz w:val="28"/>
-                <w:szCs w:val="28"/>
-              </w:rPr>
-              <w:t>Avg</w:t>
-            </w:r>
-            <w:proofErr w:type="spellEnd"/>
-            <w:r>
-              <w:rPr>
-                <w:rFonts w:eastAsia="Calibri" w:cstheme="minorHAnsi"/>
-                <w:sz w:val="28"/>
-                <w:szCs w:val="28"/>
-              </w:rPr>
-              <w:t xml:space="preserve"> = 126</w:t>
+            <w:r>
+              <w:rPr>
+                <w:rFonts w:eastAsia="Calibri" w:cstheme="minorHAnsi"/>
+                <w:sz w:val="28"/>
+                <w:szCs w:val="28"/>
+              </w:rPr>
+              <w:t>Avg = 126</w:t>
             </w:r>
           </w:p>
         </w:tc>
@@ -2902,23 +2974,13 @@
                 <w:szCs w:val="28"/>
               </w:rPr>
             </w:pPr>
-            <w:proofErr w:type="spellStart"/>
-            <w:r>
-              <w:rPr>
-                <w:rFonts w:eastAsia="Calibri" w:cstheme="minorHAnsi"/>
-                <w:sz w:val="28"/>
-                <w:szCs w:val="28"/>
-              </w:rPr>
-              <w:t>Avg</w:t>
-            </w:r>
-            <w:proofErr w:type="spellEnd"/>
-            <w:r>
-              <w:rPr>
-                <w:rFonts w:eastAsia="Calibri" w:cstheme="minorHAnsi"/>
-                <w:sz w:val="28"/>
-                <w:szCs w:val="28"/>
-              </w:rPr>
-              <w:t xml:space="preserve"> = </w:t>
+            <w:r>
+              <w:rPr>
+                <w:rFonts w:eastAsia="Calibri" w:cstheme="minorHAnsi"/>
+                <w:sz w:val="28"/>
+                <w:szCs w:val="28"/>
+              </w:rPr>
+              <w:t xml:space="preserve">Avg = </w:t>
             </w:r>
             <w:r>
               <w:rPr>
@@ -2945,23 +3007,13 @@
                 <w:szCs w:val="28"/>
               </w:rPr>
             </w:pPr>
-            <w:proofErr w:type="spellStart"/>
-            <w:r>
-              <w:rPr>
-                <w:rFonts w:eastAsia="Calibri" w:cstheme="minorHAnsi"/>
-                <w:sz w:val="28"/>
-                <w:szCs w:val="28"/>
-              </w:rPr>
-              <w:t>Avg</w:t>
-            </w:r>
-            <w:proofErr w:type="spellEnd"/>
-            <w:r>
-              <w:rPr>
-                <w:rFonts w:eastAsia="Calibri" w:cstheme="minorHAnsi"/>
-                <w:sz w:val="28"/>
-                <w:szCs w:val="28"/>
-              </w:rPr>
-              <w:t xml:space="preserve"> = </w:t>
+            <w:r>
+              <w:rPr>
+                <w:rFonts w:eastAsia="Calibri" w:cstheme="minorHAnsi"/>
+                <w:sz w:val="28"/>
+                <w:szCs w:val="28"/>
+              </w:rPr>
+              <w:t xml:space="preserve">Avg = </w:t>
             </w:r>
             <w:r>
               <w:rPr>
@@ -3152,7 +3204,6 @@
           <w:szCs w:val="28"/>
         </w:rPr>
       </w:pPr>
-      <w:proofErr w:type="gramStart"/>
       <w:r>
         <w:rPr>
           <w:b/>
@@ -3160,18 +3211,7 @@
           <w:sz w:val="28"/>
           <w:szCs w:val="28"/>
         </w:rPr>
-        <w:lastRenderedPageBreak/>
-        <w:t>Graphs :</w:t>
-      </w:r>
-      <w:proofErr w:type="gramEnd"/>
-      <w:r>
-        <w:rPr>
-          <w:b/>
-          <w:bCs/>
-          <w:sz w:val="28"/>
-          <w:szCs w:val="28"/>
-        </w:rPr>
-        <w:t xml:space="preserve"> </w:t>
+        <w:t xml:space="preserve">Graphs : </w:t>
       </w:r>
     </w:p>
     <w:p>
@@ -3273,7 +3313,6 @@
         <w:rPr>
           <w:noProof/>
         </w:rPr>
-        <w:lastRenderedPageBreak/>
         <w:drawing>
           <wp:inline distT="0" distB="0" distL="0" distR="0" wp14:anchorId="26A49466" wp14:editId="34F50EFD">
             <wp:extent cx="6645910" cy="3588888"/>

</xml_diff>

<commit_message>
modified:   Isolation/Editfile.rou.xml 	modified:   Isolation/gui_settings.xml 	modified:   PPT's/All Rule Poster.png 	modified:   PPT's/Final Observations.docx 	deleted:    PPT's/Observation table By vehicle count.pdf 	modified:   PPT's/Observation table.xlsx
</commit_message>
<xml_diff>
--- a/PPT's/Final Observations.docx
+++ b/PPT's/Final Observations.docx
@@ -924,7 +924,7 @@
                 <w:sz w:val="28"/>
                 <w:szCs w:val="28"/>
               </w:rPr>
-              <w:t>126</w:t>
+              <w:t>118</w:t>
             </w:r>
           </w:p>
         </w:tc>
@@ -944,11 +944,11 @@
             </w:pPr>
             <w:r>
               <w:rPr>
-                <w:rFonts w:eastAsia="Calibri" w:cstheme="minorHAnsi"/>
-                <w:sz w:val="28"/>
-                <w:szCs w:val="28"/>
-              </w:rPr>
-              <w:t>48</w:t>
+                <w:rFonts w:cstheme="minorHAnsi"/>
+                <w:sz w:val="28"/>
+                <w:szCs w:val="28"/>
+              </w:rPr>
+              <w:t>30</w:t>
             </w:r>
           </w:p>
         </w:tc>
@@ -972,7 +972,7 @@
                 <w:sz w:val="28"/>
                 <w:szCs w:val="28"/>
               </w:rPr>
-              <w:t>61.9</w:t>
+              <w:t>74.57</w:t>
             </w:r>
           </w:p>
         </w:tc>
@@ -1022,11 +1022,11 @@
             </w:pPr>
             <w:r>
               <w:rPr>
-                <w:rFonts w:eastAsia="Calibri" w:cstheme="minorHAnsi"/>
-                <w:sz w:val="28"/>
-                <w:szCs w:val="28"/>
-              </w:rPr>
-              <w:t>126</w:t>
+                <w:rFonts w:cstheme="minorHAnsi"/>
+                <w:sz w:val="28"/>
+                <w:szCs w:val="28"/>
+              </w:rPr>
+              <w:t>118</w:t>
             </w:r>
           </w:p>
         </w:tc>
@@ -1046,11 +1046,11 @@
             </w:pPr>
             <w:r>
               <w:rPr>
-                <w:rFonts w:eastAsia="Calibri" w:cstheme="minorHAnsi"/>
-                <w:sz w:val="28"/>
-                <w:szCs w:val="28"/>
-              </w:rPr>
-              <w:t>65</w:t>
+                <w:rFonts w:cstheme="minorHAnsi"/>
+                <w:sz w:val="28"/>
+                <w:szCs w:val="28"/>
+              </w:rPr>
+              <w:t>50</w:t>
             </w:r>
           </w:p>
         </w:tc>
@@ -1074,7 +1074,7 @@
                 <w:sz w:val="28"/>
                 <w:szCs w:val="28"/>
               </w:rPr>
-              <w:t>48.41</w:t>
+              <w:t>57.62</w:t>
             </w:r>
           </w:p>
         </w:tc>
@@ -1124,11 +1124,11 @@
             </w:pPr>
             <w:r>
               <w:rPr>
-                <w:rFonts w:eastAsia="Calibri" w:cstheme="minorHAnsi"/>
-                <w:sz w:val="28"/>
-                <w:szCs w:val="28"/>
-              </w:rPr>
-              <w:t>126</w:t>
+                <w:rFonts w:cstheme="minorHAnsi"/>
+                <w:sz w:val="28"/>
+                <w:szCs w:val="28"/>
+              </w:rPr>
+              <w:t>118</w:t>
             </w:r>
           </w:p>
         </w:tc>
@@ -1148,11 +1148,11 @@
             </w:pPr>
             <w:r>
               <w:rPr>
-                <w:rFonts w:eastAsia="Calibri" w:cstheme="minorHAnsi"/>
-                <w:sz w:val="28"/>
-                <w:szCs w:val="28"/>
-              </w:rPr>
-              <w:t>72</w:t>
+                <w:rFonts w:cstheme="minorHAnsi"/>
+                <w:sz w:val="28"/>
+                <w:szCs w:val="28"/>
+              </w:rPr>
+              <w:t>56</w:t>
             </w:r>
           </w:p>
         </w:tc>
@@ -1176,7 +1176,7 @@
                 <w:sz w:val="28"/>
                 <w:szCs w:val="28"/>
               </w:rPr>
-              <w:t>42.85</w:t>
+              <w:t>52.54</w:t>
             </w:r>
           </w:p>
         </w:tc>
@@ -1230,7 +1230,15 @@
                 <w:sz w:val="28"/>
                 <w:szCs w:val="28"/>
               </w:rPr>
-              <w:t>126</w:t>
+              <w:t>1</w:t>
+            </w:r>
+            <w:r>
+              <w:rPr>
+                <w:rFonts w:eastAsia="Calibri" w:cstheme="minorHAnsi"/>
+                <w:sz w:val="28"/>
+                <w:szCs w:val="28"/>
+              </w:rPr>
+              <w:t>18</w:t>
             </w:r>
           </w:p>
         </w:tc>
@@ -1250,11 +1258,11 @@
             </w:pPr>
             <w:r>
               <w:rPr>
-                <w:rFonts w:eastAsia="Calibri" w:cstheme="minorHAnsi"/>
-                <w:sz w:val="28"/>
-                <w:szCs w:val="28"/>
-              </w:rPr>
-              <w:t>70</w:t>
+                <w:rFonts w:cstheme="minorHAnsi"/>
+                <w:sz w:val="28"/>
+                <w:szCs w:val="28"/>
+              </w:rPr>
+              <w:t>58</w:t>
             </w:r>
           </w:p>
         </w:tc>
@@ -1278,7 +1286,7 @@
                 <w:sz w:val="28"/>
                 <w:szCs w:val="28"/>
               </w:rPr>
-              <w:t>44.44</w:t>
+              <w:t>50.84</w:t>
             </w:r>
           </w:p>
         </w:tc>
@@ -1332,7 +1340,15 @@
                 <w:sz w:val="28"/>
                 <w:szCs w:val="28"/>
               </w:rPr>
-              <w:t>126</w:t>
+              <w:t>1</w:t>
+            </w:r>
+            <w:r>
+              <w:rPr>
+                <w:rFonts w:eastAsia="Calibri" w:cstheme="minorHAnsi"/>
+                <w:sz w:val="28"/>
+                <w:szCs w:val="28"/>
+              </w:rPr>
+              <w:t>18</w:t>
             </w:r>
           </w:p>
         </w:tc>
@@ -1352,11 +1368,11 @@
             </w:pPr>
             <w:r>
               <w:rPr>
-                <w:rFonts w:eastAsia="Calibri" w:cstheme="minorHAnsi"/>
-                <w:sz w:val="28"/>
-                <w:szCs w:val="28"/>
-              </w:rPr>
-              <w:t>82</w:t>
+                <w:rFonts w:cstheme="minorHAnsi"/>
+                <w:sz w:val="28"/>
+                <w:szCs w:val="28"/>
+              </w:rPr>
+              <w:t>55</w:t>
             </w:r>
           </w:p>
         </w:tc>
@@ -1380,7 +1396,7 @@
                 <w:sz w:val="28"/>
                 <w:szCs w:val="28"/>
               </w:rPr>
-              <w:t>34.92</w:t>
+              <w:t>53.38</w:t>
             </w:r>
           </w:p>
         </w:tc>
@@ -1434,7 +1450,15 @@
                 <w:sz w:val="28"/>
                 <w:szCs w:val="28"/>
               </w:rPr>
-              <w:t>126</w:t>
+              <w:t>1</w:t>
+            </w:r>
+            <w:r>
+              <w:rPr>
+                <w:rFonts w:eastAsia="Calibri" w:cstheme="minorHAnsi"/>
+                <w:sz w:val="28"/>
+                <w:szCs w:val="28"/>
+              </w:rPr>
+              <w:t>18</w:t>
             </w:r>
           </w:p>
         </w:tc>
@@ -1454,11 +1478,11 @@
             </w:pPr>
             <w:r>
               <w:rPr>
-                <w:rFonts w:eastAsia="Calibri" w:cstheme="minorHAnsi"/>
-                <w:sz w:val="28"/>
-                <w:szCs w:val="28"/>
-              </w:rPr>
-              <w:t>97</w:t>
+                <w:rFonts w:cstheme="minorHAnsi"/>
+                <w:sz w:val="28"/>
+                <w:szCs w:val="28"/>
+              </w:rPr>
+              <w:t>84</w:t>
             </w:r>
           </w:p>
         </w:tc>
@@ -1482,7 +1506,7 @@
                 <w:sz w:val="28"/>
                 <w:szCs w:val="28"/>
               </w:rPr>
-              <w:t>23.01</w:t>
+              <w:t>28.81</w:t>
             </w:r>
           </w:p>
         </w:tc>
@@ -1536,7 +1560,15 @@
                 <w:sz w:val="28"/>
                 <w:szCs w:val="28"/>
               </w:rPr>
-              <w:t>126</w:t>
+              <w:t>1</w:t>
+            </w:r>
+            <w:r>
+              <w:rPr>
+                <w:rFonts w:eastAsia="Calibri" w:cstheme="minorHAnsi"/>
+                <w:sz w:val="28"/>
+                <w:szCs w:val="28"/>
+              </w:rPr>
+              <w:t>18</w:t>
             </w:r>
           </w:p>
         </w:tc>
@@ -1556,11 +1588,11 @@
             </w:pPr>
             <w:r>
               <w:rPr>
-                <w:rFonts w:eastAsia="Calibri" w:cstheme="minorHAnsi"/>
-                <w:sz w:val="28"/>
-                <w:szCs w:val="28"/>
-              </w:rPr>
-              <w:t>132</w:t>
+                <w:rFonts w:cstheme="minorHAnsi"/>
+                <w:sz w:val="28"/>
+                <w:szCs w:val="28"/>
+              </w:rPr>
+              <w:t>93</w:t>
             </w:r>
           </w:p>
         </w:tc>
@@ -1584,7 +1616,7 @@
                 <w:sz w:val="28"/>
                 <w:szCs w:val="28"/>
               </w:rPr>
-              <w:t>-0.0476</w:t>
+              <w:t>21.18</w:t>
             </w:r>
           </w:p>
         </w:tc>
@@ -1638,7 +1670,15 @@
                 <w:sz w:val="28"/>
                 <w:szCs w:val="28"/>
               </w:rPr>
-              <w:t>126</w:t>
+              <w:t>1</w:t>
+            </w:r>
+            <w:r>
+              <w:rPr>
+                <w:rFonts w:eastAsia="Calibri" w:cstheme="minorHAnsi"/>
+                <w:sz w:val="28"/>
+                <w:szCs w:val="28"/>
+              </w:rPr>
+              <w:t>18</w:t>
             </w:r>
           </w:p>
         </w:tc>
@@ -1658,11 +1698,11 @@
             </w:pPr>
             <w:r>
               <w:rPr>
-                <w:rFonts w:eastAsia="Calibri" w:cstheme="minorHAnsi"/>
-                <w:sz w:val="28"/>
-                <w:szCs w:val="28"/>
-              </w:rPr>
-              <w:t>100</w:t>
+                <w:rFonts w:cstheme="minorHAnsi"/>
+                <w:sz w:val="28"/>
+                <w:szCs w:val="28"/>
+              </w:rPr>
+              <w:t>104</w:t>
             </w:r>
           </w:p>
         </w:tc>
@@ -1686,7 +1726,7 @@
                 <w:sz w:val="28"/>
                 <w:szCs w:val="28"/>
               </w:rPr>
-              <w:t>20.63</w:t>
+              <w:t>11.86</w:t>
             </w:r>
           </w:p>
         </w:tc>
@@ -1740,7 +1780,15 @@
                 <w:sz w:val="28"/>
                 <w:szCs w:val="28"/>
               </w:rPr>
-              <w:t>126</w:t>
+              <w:t>1</w:t>
+            </w:r>
+            <w:r>
+              <w:rPr>
+                <w:rFonts w:eastAsia="Calibri" w:cstheme="minorHAnsi"/>
+                <w:sz w:val="28"/>
+                <w:szCs w:val="28"/>
+              </w:rPr>
+              <w:t>18</w:t>
             </w:r>
           </w:p>
         </w:tc>
@@ -1760,11 +1808,11 @@
             </w:pPr>
             <w:r>
               <w:rPr>
-                <w:rFonts w:eastAsia="Calibri" w:cstheme="minorHAnsi"/>
-                <w:sz w:val="28"/>
-                <w:szCs w:val="28"/>
-              </w:rPr>
-              <w:t>107</w:t>
+                <w:rFonts w:cstheme="minorHAnsi"/>
+                <w:sz w:val="28"/>
+                <w:szCs w:val="28"/>
+              </w:rPr>
+              <w:t>96</w:t>
             </w:r>
           </w:p>
         </w:tc>
@@ -1788,7 +1836,7 @@
                 <w:sz w:val="28"/>
                 <w:szCs w:val="28"/>
               </w:rPr>
-              <w:t>15.07</w:t>
+              <w:t>18.64</w:t>
             </w:r>
           </w:p>
         </w:tc>
@@ -1842,7 +1890,15 @@
                 <w:sz w:val="28"/>
                 <w:szCs w:val="28"/>
               </w:rPr>
-              <w:t>126</w:t>
+              <w:t>1</w:t>
+            </w:r>
+            <w:r>
+              <w:rPr>
+                <w:rFonts w:eastAsia="Calibri" w:cstheme="minorHAnsi"/>
+                <w:sz w:val="28"/>
+                <w:szCs w:val="28"/>
+              </w:rPr>
+              <w:t>18</w:t>
             </w:r>
           </w:p>
         </w:tc>
@@ -1862,11 +1918,11 @@
             </w:pPr>
             <w:r>
               <w:rPr>
-                <w:rFonts w:eastAsia="Calibri" w:cstheme="minorHAnsi"/>
-                <w:sz w:val="28"/>
-                <w:szCs w:val="28"/>
-              </w:rPr>
-              <w:t>57</w:t>
+                <w:rFonts w:cstheme="minorHAnsi"/>
+                <w:sz w:val="28"/>
+                <w:szCs w:val="28"/>
+              </w:rPr>
+              <w:t>50</w:t>
             </w:r>
           </w:p>
         </w:tc>
@@ -1890,7 +1946,15 @@
                 <w:sz w:val="28"/>
                 <w:szCs w:val="28"/>
               </w:rPr>
-              <w:t>54.76</w:t>
+              <w:t>5</w:t>
+            </w:r>
+            <w:r>
+              <w:rPr>
+                <w:rFonts w:eastAsia="Calibri" w:cstheme="minorHAnsi"/>
+                <w:sz w:val="28"/>
+                <w:szCs w:val="28"/>
+              </w:rPr>
+              <w:t>7.62</w:t>
             </w:r>
           </w:p>
         </w:tc>
@@ -1944,7 +2008,15 @@
                 <w:sz w:val="28"/>
                 <w:szCs w:val="28"/>
               </w:rPr>
-              <w:t>126</w:t>
+              <w:t>1</w:t>
+            </w:r>
+            <w:r>
+              <w:rPr>
+                <w:rFonts w:eastAsia="Calibri" w:cstheme="minorHAnsi"/>
+                <w:sz w:val="28"/>
+                <w:szCs w:val="28"/>
+              </w:rPr>
+              <w:t>18</w:t>
             </w:r>
           </w:p>
         </w:tc>
@@ -1964,11 +2036,11 @@
             </w:pPr>
             <w:r>
               <w:rPr>
-                <w:rFonts w:eastAsia="Calibri" w:cstheme="minorHAnsi"/>
-                <w:sz w:val="28"/>
-                <w:szCs w:val="28"/>
-              </w:rPr>
-              <w:t>112</w:t>
+                <w:rFonts w:cstheme="minorHAnsi"/>
+                <w:sz w:val="28"/>
+                <w:szCs w:val="28"/>
+              </w:rPr>
+              <w:t>57</w:t>
             </w:r>
           </w:p>
         </w:tc>
@@ -1992,7 +2064,7 @@
                 <w:sz w:val="28"/>
                 <w:szCs w:val="28"/>
               </w:rPr>
-              <w:t>11.11</w:t>
+              <w:t>51.69</w:t>
             </w:r>
           </w:p>
         </w:tc>
@@ -2046,7 +2118,15 @@
                 <w:sz w:val="28"/>
                 <w:szCs w:val="28"/>
               </w:rPr>
-              <w:t>126</w:t>
+              <w:t>1</w:t>
+            </w:r>
+            <w:r>
+              <w:rPr>
+                <w:rFonts w:eastAsia="Calibri" w:cstheme="minorHAnsi"/>
+                <w:sz w:val="28"/>
+                <w:szCs w:val="28"/>
+              </w:rPr>
+              <w:t>18</w:t>
             </w:r>
           </w:p>
         </w:tc>
@@ -2066,11 +2146,11 @@
             </w:pPr>
             <w:r>
               <w:rPr>
-                <w:rFonts w:eastAsia="Calibri" w:cstheme="minorHAnsi"/>
-                <w:sz w:val="28"/>
-                <w:szCs w:val="28"/>
-              </w:rPr>
-              <w:t>154</w:t>
+                <w:rFonts w:cstheme="minorHAnsi"/>
+                <w:sz w:val="28"/>
+                <w:szCs w:val="28"/>
+              </w:rPr>
+              <w:t>78</w:t>
             </w:r>
           </w:p>
         </w:tc>
@@ -2094,7 +2174,7 @@
                 <w:sz w:val="28"/>
                 <w:szCs w:val="28"/>
               </w:rPr>
-              <w:t>-22.22</w:t>
+              <w:t>33.89</w:t>
             </w:r>
           </w:p>
         </w:tc>
@@ -2148,7 +2228,15 @@
                 <w:sz w:val="28"/>
                 <w:szCs w:val="28"/>
               </w:rPr>
-              <w:t>126</w:t>
+              <w:t>1</w:t>
+            </w:r>
+            <w:r>
+              <w:rPr>
+                <w:rFonts w:eastAsia="Calibri" w:cstheme="minorHAnsi"/>
+                <w:sz w:val="28"/>
+                <w:szCs w:val="28"/>
+              </w:rPr>
+              <w:t>18</w:t>
             </w:r>
           </w:p>
         </w:tc>
@@ -2168,11 +2256,11 @@
             </w:pPr>
             <w:r>
               <w:rPr>
-                <w:rFonts w:eastAsia="Calibri" w:cstheme="minorHAnsi"/>
-                <w:sz w:val="28"/>
-                <w:szCs w:val="28"/>
-              </w:rPr>
-              <w:t>92</w:t>
+                <w:rFonts w:cstheme="minorHAnsi"/>
+                <w:sz w:val="28"/>
+                <w:szCs w:val="28"/>
+              </w:rPr>
+              <w:t>165</w:t>
             </w:r>
           </w:p>
         </w:tc>
@@ -2196,7 +2284,7 @@
                 <w:sz w:val="28"/>
                 <w:szCs w:val="28"/>
               </w:rPr>
-              <w:t>26.98</w:t>
+              <w:t>-39.83</w:t>
             </w:r>
           </w:p>
         </w:tc>
@@ -2246,11 +2334,11 @@
             </w:pPr>
             <w:r>
               <w:rPr>
-                <w:rFonts w:eastAsia="Calibri" w:cstheme="minorHAnsi"/>
-                <w:sz w:val="28"/>
-                <w:szCs w:val="28"/>
-              </w:rPr>
-              <w:t>126</w:t>
+                <w:rFonts w:cstheme="minorHAnsi"/>
+                <w:sz w:val="28"/>
+                <w:szCs w:val="28"/>
+              </w:rPr>
+              <w:t>118</w:t>
             </w:r>
           </w:p>
         </w:tc>
@@ -2270,7 +2358,7 @@
             </w:pPr>
             <w:r>
               <w:rPr>
-                <w:rFonts w:eastAsia="Calibri" w:cstheme="minorHAnsi"/>
+                <w:rFonts w:cstheme="minorHAnsi"/>
                 <w:sz w:val="28"/>
                 <w:szCs w:val="28"/>
               </w:rPr>
@@ -2298,7 +2386,15 @@
                 <w:sz w:val="28"/>
                 <w:szCs w:val="28"/>
               </w:rPr>
-              <w:t>65.07</w:t>
+              <w:t>6</w:t>
+            </w:r>
+            <w:r>
+              <w:rPr>
+                <w:rFonts w:eastAsia="Calibri" w:cstheme="minorHAnsi"/>
+                <w:sz w:val="28"/>
+                <w:szCs w:val="28"/>
+              </w:rPr>
+              <w:t>2.71</w:t>
             </w:r>
           </w:p>
         </w:tc>
@@ -2352,7 +2448,15 @@
                 <w:sz w:val="28"/>
                 <w:szCs w:val="28"/>
               </w:rPr>
-              <w:t>126</w:t>
+              <w:t>1</w:t>
+            </w:r>
+            <w:r>
+              <w:rPr>
+                <w:rFonts w:eastAsia="Calibri" w:cstheme="minorHAnsi"/>
+                <w:sz w:val="28"/>
+                <w:szCs w:val="28"/>
+              </w:rPr>
+              <w:t>18</w:t>
             </w:r>
           </w:p>
         </w:tc>
@@ -2454,7 +2558,15 @@
                 <w:sz w:val="28"/>
                 <w:szCs w:val="28"/>
               </w:rPr>
-              <w:t>126</w:t>
+              <w:t>1</w:t>
+            </w:r>
+            <w:r>
+              <w:rPr>
+                <w:rFonts w:eastAsia="Calibri" w:cstheme="minorHAnsi"/>
+                <w:sz w:val="28"/>
+                <w:szCs w:val="28"/>
+              </w:rPr>
+              <w:t>18</w:t>
             </w:r>
           </w:p>
         </w:tc>
@@ -2474,11 +2586,11 @@
             </w:pPr>
             <w:r>
               <w:rPr>
-                <w:rFonts w:eastAsia="Calibri" w:cstheme="minorHAnsi"/>
-                <w:sz w:val="28"/>
-                <w:szCs w:val="28"/>
-              </w:rPr>
-              <w:t>60</w:t>
+                <w:rFonts w:cstheme="minorHAnsi"/>
+                <w:sz w:val="28"/>
+                <w:szCs w:val="28"/>
+              </w:rPr>
+              <w:t>55</w:t>
             </w:r>
           </w:p>
         </w:tc>
@@ -2502,7 +2614,23 @@
                 <w:sz w:val="28"/>
                 <w:szCs w:val="28"/>
               </w:rPr>
-              <w:t>52.38</w:t>
+              <w:t>5</w:t>
+            </w:r>
+            <w:r>
+              <w:rPr>
+                <w:rFonts w:eastAsia="Calibri" w:cstheme="minorHAnsi"/>
+                <w:sz w:val="28"/>
+                <w:szCs w:val="28"/>
+              </w:rPr>
+              <w:t>3</w:t>
+            </w:r>
+            <w:r>
+              <w:rPr>
+                <w:rFonts w:eastAsia="Calibri" w:cstheme="minorHAnsi"/>
+                <w:sz w:val="28"/>
+                <w:szCs w:val="28"/>
+              </w:rPr>
+              <w:t>.38</w:t>
             </w:r>
           </w:p>
         </w:tc>
@@ -2556,7 +2684,15 @@
                 <w:sz w:val="28"/>
                 <w:szCs w:val="28"/>
               </w:rPr>
-              <w:t>126</w:t>
+              <w:t>1</w:t>
+            </w:r>
+            <w:r>
+              <w:rPr>
+                <w:rFonts w:eastAsia="Calibri" w:cstheme="minorHAnsi"/>
+                <w:sz w:val="28"/>
+                <w:szCs w:val="28"/>
+              </w:rPr>
+              <w:t>18</w:t>
             </w:r>
           </w:p>
         </w:tc>
@@ -2576,11 +2712,11 @@
             </w:pPr>
             <w:r>
               <w:rPr>
-                <w:rFonts w:eastAsia="Calibri" w:cstheme="minorHAnsi"/>
-                <w:sz w:val="28"/>
-                <w:szCs w:val="28"/>
-              </w:rPr>
-              <w:t>68</w:t>
+                <w:rFonts w:cstheme="minorHAnsi"/>
+                <w:sz w:val="28"/>
+                <w:szCs w:val="28"/>
+              </w:rPr>
+              <w:t>58</w:t>
             </w:r>
           </w:p>
         </w:tc>
@@ -2604,7 +2740,7 @@
                 <w:sz w:val="28"/>
                 <w:szCs w:val="28"/>
               </w:rPr>
-              <w:t>46.03</w:t>
+              <w:t>50.84</w:t>
             </w:r>
           </w:p>
         </w:tc>
@@ -2658,7 +2794,15 @@
                 <w:sz w:val="28"/>
                 <w:szCs w:val="28"/>
               </w:rPr>
-              <w:t>126</w:t>
+              <w:t>1</w:t>
+            </w:r>
+            <w:r>
+              <w:rPr>
+                <w:rFonts w:eastAsia="Calibri" w:cstheme="minorHAnsi"/>
+                <w:sz w:val="28"/>
+                <w:szCs w:val="28"/>
+              </w:rPr>
+              <w:t>18</w:t>
             </w:r>
           </w:p>
         </w:tc>
@@ -2678,11 +2822,11 @@
             </w:pPr>
             <w:r>
               <w:rPr>
-                <w:rFonts w:eastAsia="Calibri" w:cstheme="minorHAnsi"/>
-                <w:sz w:val="28"/>
-                <w:szCs w:val="28"/>
-              </w:rPr>
-              <w:t>67</w:t>
+                <w:rFonts w:cstheme="minorHAnsi"/>
+                <w:sz w:val="28"/>
+                <w:szCs w:val="28"/>
+              </w:rPr>
+              <w:t>60</w:t>
             </w:r>
           </w:p>
         </w:tc>
@@ -2706,7 +2850,15 @@
                 <w:sz w:val="28"/>
                 <w:szCs w:val="28"/>
               </w:rPr>
-              <w:t>46.82</w:t>
+              <w:t>4</w:t>
+            </w:r>
+            <w:r>
+              <w:rPr>
+                <w:rFonts w:eastAsia="Calibri" w:cstheme="minorHAnsi"/>
+                <w:sz w:val="28"/>
+                <w:szCs w:val="28"/>
+              </w:rPr>
+              <w:t>9.15</w:t>
             </w:r>
           </w:p>
         </w:tc>
@@ -2760,7 +2912,15 @@
                 <w:sz w:val="28"/>
                 <w:szCs w:val="28"/>
               </w:rPr>
-              <w:t>126</w:t>
+              <w:t>1</w:t>
+            </w:r>
+            <w:r>
+              <w:rPr>
+                <w:rFonts w:eastAsia="Calibri" w:cstheme="minorHAnsi"/>
+                <w:sz w:val="28"/>
+                <w:szCs w:val="28"/>
+              </w:rPr>
+              <w:t>18</w:t>
             </w:r>
           </w:p>
         </w:tc>
@@ -2780,11 +2940,11 @@
             </w:pPr>
             <w:r>
               <w:rPr>
-                <w:rFonts w:eastAsia="Calibri" w:cstheme="minorHAnsi"/>
-                <w:sz w:val="28"/>
-                <w:szCs w:val="28"/>
-              </w:rPr>
-              <w:t>129</w:t>
+                <w:rFonts w:cstheme="minorHAnsi"/>
+                <w:sz w:val="28"/>
+                <w:szCs w:val="28"/>
+              </w:rPr>
+              <w:t>84</w:t>
             </w:r>
           </w:p>
         </w:tc>
@@ -2808,7 +2968,7 @@
                 <w:sz w:val="28"/>
                 <w:szCs w:val="28"/>
               </w:rPr>
-              <w:t>-0.0238</w:t>
+              <w:t>28.81</w:t>
             </w:r>
           </w:p>
         </w:tc>
@@ -2862,7 +3022,15 @@
                 <w:sz w:val="28"/>
                 <w:szCs w:val="28"/>
               </w:rPr>
-              <w:t>126</w:t>
+              <w:t>1</w:t>
+            </w:r>
+            <w:r>
+              <w:rPr>
+                <w:rFonts w:eastAsia="Calibri" w:cstheme="minorHAnsi"/>
+                <w:sz w:val="28"/>
+                <w:szCs w:val="28"/>
+              </w:rPr>
+              <w:t>18</w:t>
             </w:r>
           </w:p>
         </w:tc>
@@ -2886,7 +3054,7 @@
                 <w:sz w:val="28"/>
                 <w:szCs w:val="28"/>
               </w:rPr>
-              <w:t>160</w:t>
+              <w:t>100</w:t>
             </w:r>
           </w:p>
         </w:tc>
@@ -2910,7 +3078,613 @@
                 <w:sz w:val="28"/>
                 <w:szCs w:val="28"/>
               </w:rPr>
-              <w:t>-26.98</w:t>
+              <w:t>15.25</w:t>
+            </w:r>
+          </w:p>
+        </w:tc>
+      </w:tr>
+      <w:tr>
+        <w:trPr>
+          <w:trHeight w:val="290"/>
+          <w:jc w:val="center"/>
+        </w:trPr>
+        <w:tc>
+          <w:tcPr>
+            <w:tcW w:w="2046" w:type="dxa"/>
+          </w:tcPr>
+          <w:p>
+            <w:pPr>
+              <w:ind w:right="44"/>
+              <w:jc w:val="center"/>
+              <w:rPr>
+                <w:rFonts w:eastAsia="Calibri" w:cstheme="minorHAnsi"/>
+                <w:sz w:val="28"/>
+                <w:szCs w:val="28"/>
+              </w:rPr>
+            </w:pPr>
+            <w:r>
+              <w:rPr>
+                <w:rFonts w:eastAsia="Calibri" w:cstheme="minorHAnsi"/>
+                <w:sz w:val="28"/>
+                <w:szCs w:val="28"/>
+              </w:rPr>
+              <w:t>Case - 21</w:t>
+            </w:r>
+          </w:p>
+        </w:tc>
+        <w:tc>
+          <w:tcPr>
+            <w:tcW w:w="2045" w:type="dxa"/>
+          </w:tcPr>
+          <w:p>
+            <w:pPr>
+              <w:ind w:right="43"/>
+              <w:jc w:val="center"/>
+              <w:rPr>
+                <w:rFonts w:eastAsia="Calibri" w:cstheme="minorHAnsi"/>
+                <w:sz w:val="28"/>
+                <w:szCs w:val="28"/>
+              </w:rPr>
+            </w:pPr>
+            <w:r>
+              <w:rPr>
+                <w:rFonts w:eastAsia="Calibri" w:cstheme="minorHAnsi"/>
+                <w:sz w:val="28"/>
+                <w:szCs w:val="28"/>
+              </w:rPr>
+              <w:t>118</w:t>
+            </w:r>
+          </w:p>
+        </w:tc>
+        <w:tc>
+          <w:tcPr>
+            <w:tcW w:w="2045" w:type="dxa"/>
+          </w:tcPr>
+          <w:p>
+            <w:pPr>
+              <w:ind w:right="44"/>
+              <w:jc w:val="center"/>
+              <w:rPr>
+                <w:rFonts w:eastAsia="Calibri" w:cstheme="minorHAnsi"/>
+                <w:sz w:val="28"/>
+                <w:szCs w:val="28"/>
+              </w:rPr>
+            </w:pPr>
+            <w:r>
+              <w:rPr>
+                <w:rFonts w:eastAsia="Calibri" w:cstheme="minorHAnsi"/>
+                <w:sz w:val="28"/>
+                <w:szCs w:val="28"/>
+              </w:rPr>
+              <w:t>76</w:t>
+            </w:r>
+          </w:p>
+        </w:tc>
+        <w:tc>
+          <w:tcPr>
+            <w:tcW w:w="2151" w:type="dxa"/>
+          </w:tcPr>
+          <w:p>
+            <w:pPr>
+              <w:ind w:right="43"/>
+              <w:jc w:val="center"/>
+              <w:rPr>
+                <w:rFonts w:eastAsia="Calibri" w:cstheme="minorHAnsi"/>
+                <w:sz w:val="28"/>
+                <w:szCs w:val="28"/>
+              </w:rPr>
+            </w:pPr>
+            <w:r>
+              <w:rPr>
+                <w:rFonts w:eastAsia="Calibri" w:cstheme="minorHAnsi"/>
+                <w:sz w:val="28"/>
+                <w:szCs w:val="28"/>
+              </w:rPr>
+              <w:t>35.59</w:t>
+            </w:r>
+          </w:p>
+        </w:tc>
+      </w:tr>
+      <w:tr>
+        <w:trPr>
+          <w:trHeight w:val="290"/>
+          <w:jc w:val="center"/>
+        </w:trPr>
+        <w:tc>
+          <w:tcPr>
+            <w:tcW w:w="2046" w:type="dxa"/>
+          </w:tcPr>
+          <w:p>
+            <w:pPr>
+              <w:ind w:right="44"/>
+              <w:jc w:val="center"/>
+              <w:rPr>
+                <w:rFonts w:eastAsia="Calibri" w:cstheme="minorHAnsi"/>
+                <w:sz w:val="28"/>
+                <w:szCs w:val="28"/>
+              </w:rPr>
+            </w:pPr>
+            <w:r>
+              <w:rPr>
+                <w:rFonts w:eastAsia="Calibri" w:cstheme="minorHAnsi"/>
+                <w:sz w:val="28"/>
+                <w:szCs w:val="28"/>
+              </w:rPr>
+              <w:t xml:space="preserve">Case </w:t>
+            </w:r>
+            <w:r>
+              <w:rPr>
+                <w:rFonts w:eastAsia="Calibri" w:cstheme="minorHAnsi"/>
+                <w:sz w:val="28"/>
+                <w:szCs w:val="28"/>
+              </w:rPr>
+              <w:t>–</w:t>
+            </w:r>
+            <w:r>
+              <w:rPr>
+                <w:rFonts w:eastAsia="Calibri" w:cstheme="minorHAnsi"/>
+                <w:sz w:val="28"/>
+                <w:szCs w:val="28"/>
+              </w:rPr>
+              <w:t xml:space="preserve"> 2</w:t>
+            </w:r>
+            <w:r>
+              <w:rPr>
+                <w:rFonts w:eastAsia="Calibri" w:cstheme="minorHAnsi"/>
+                <w:sz w:val="28"/>
+                <w:szCs w:val="28"/>
+              </w:rPr>
+              <w:t>2</w:t>
+            </w:r>
+          </w:p>
+        </w:tc>
+        <w:tc>
+          <w:tcPr>
+            <w:tcW w:w="2045" w:type="dxa"/>
+          </w:tcPr>
+          <w:p>
+            <w:pPr>
+              <w:ind w:right="43"/>
+              <w:jc w:val="center"/>
+              <w:rPr>
+                <w:rFonts w:eastAsia="Calibri" w:cstheme="minorHAnsi"/>
+                <w:sz w:val="28"/>
+                <w:szCs w:val="28"/>
+              </w:rPr>
+            </w:pPr>
+            <w:r>
+              <w:rPr>
+                <w:rFonts w:eastAsia="Calibri" w:cstheme="minorHAnsi"/>
+                <w:sz w:val="28"/>
+                <w:szCs w:val="28"/>
+              </w:rPr>
+              <w:t>118</w:t>
+            </w:r>
+          </w:p>
+        </w:tc>
+        <w:tc>
+          <w:tcPr>
+            <w:tcW w:w="2045" w:type="dxa"/>
+          </w:tcPr>
+          <w:p>
+            <w:pPr>
+              <w:ind w:right="44"/>
+              <w:jc w:val="center"/>
+              <w:rPr>
+                <w:rFonts w:eastAsia="Calibri" w:cstheme="minorHAnsi"/>
+                <w:sz w:val="28"/>
+                <w:szCs w:val="28"/>
+              </w:rPr>
+            </w:pPr>
+            <w:r>
+              <w:rPr>
+                <w:rFonts w:eastAsia="Calibri" w:cstheme="minorHAnsi"/>
+                <w:sz w:val="28"/>
+                <w:szCs w:val="28"/>
+              </w:rPr>
+              <w:t>75</w:t>
+            </w:r>
+          </w:p>
+        </w:tc>
+        <w:tc>
+          <w:tcPr>
+            <w:tcW w:w="2151" w:type="dxa"/>
+          </w:tcPr>
+          <w:p>
+            <w:pPr>
+              <w:ind w:right="43"/>
+              <w:jc w:val="center"/>
+              <w:rPr>
+                <w:rFonts w:eastAsia="Calibri" w:cstheme="minorHAnsi"/>
+                <w:sz w:val="28"/>
+                <w:szCs w:val="28"/>
+              </w:rPr>
+            </w:pPr>
+            <w:r>
+              <w:rPr>
+                <w:rFonts w:eastAsia="Calibri" w:cstheme="minorHAnsi"/>
+                <w:sz w:val="28"/>
+                <w:szCs w:val="28"/>
+              </w:rPr>
+              <w:t>36.44</w:t>
+            </w:r>
+          </w:p>
+        </w:tc>
+      </w:tr>
+      <w:tr>
+        <w:trPr>
+          <w:trHeight w:val="290"/>
+          <w:jc w:val="center"/>
+        </w:trPr>
+        <w:tc>
+          <w:tcPr>
+            <w:tcW w:w="2046" w:type="dxa"/>
+          </w:tcPr>
+          <w:p>
+            <w:pPr>
+              <w:ind w:right="44"/>
+              <w:jc w:val="center"/>
+              <w:rPr>
+                <w:rFonts w:eastAsia="Calibri" w:cstheme="minorHAnsi"/>
+                <w:sz w:val="28"/>
+                <w:szCs w:val="28"/>
+              </w:rPr>
+            </w:pPr>
+            <w:r>
+              <w:rPr>
+                <w:rFonts w:eastAsia="Calibri" w:cstheme="minorHAnsi"/>
+                <w:sz w:val="28"/>
+                <w:szCs w:val="28"/>
+              </w:rPr>
+              <w:t xml:space="preserve">Case </w:t>
+            </w:r>
+            <w:r>
+              <w:rPr>
+                <w:rFonts w:eastAsia="Calibri" w:cstheme="minorHAnsi"/>
+                <w:sz w:val="28"/>
+                <w:szCs w:val="28"/>
+              </w:rPr>
+              <w:t>–</w:t>
+            </w:r>
+            <w:r>
+              <w:rPr>
+                <w:rFonts w:eastAsia="Calibri" w:cstheme="minorHAnsi"/>
+                <w:sz w:val="28"/>
+                <w:szCs w:val="28"/>
+              </w:rPr>
+              <w:t xml:space="preserve"> 2</w:t>
+            </w:r>
+            <w:r>
+              <w:rPr>
+                <w:rFonts w:eastAsia="Calibri" w:cstheme="minorHAnsi"/>
+                <w:sz w:val="28"/>
+                <w:szCs w:val="28"/>
+              </w:rPr>
+              <w:t>3</w:t>
+            </w:r>
+          </w:p>
+        </w:tc>
+        <w:tc>
+          <w:tcPr>
+            <w:tcW w:w="2045" w:type="dxa"/>
+          </w:tcPr>
+          <w:p>
+            <w:pPr>
+              <w:ind w:right="43"/>
+              <w:jc w:val="center"/>
+              <w:rPr>
+                <w:rFonts w:eastAsia="Calibri" w:cstheme="minorHAnsi"/>
+                <w:sz w:val="28"/>
+                <w:szCs w:val="28"/>
+              </w:rPr>
+            </w:pPr>
+            <w:r>
+              <w:rPr>
+                <w:rFonts w:eastAsia="Calibri" w:cstheme="minorHAnsi"/>
+                <w:sz w:val="28"/>
+                <w:szCs w:val="28"/>
+              </w:rPr>
+              <w:t>118</w:t>
+            </w:r>
+          </w:p>
+        </w:tc>
+        <w:tc>
+          <w:tcPr>
+            <w:tcW w:w="2045" w:type="dxa"/>
+          </w:tcPr>
+          <w:p>
+            <w:pPr>
+              <w:ind w:right="44"/>
+              <w:jc w:val="center"/>
+              <w:rPr>
+                <w:rFonts w:eastAsia="Calibri" w:cstheme="minorHAnsi"/>
+                <w:sz w:val="28"/>
+                <w:szCs w:val="28"/>
+              </w:rPr>
+            </w:pPr>
+            <w:r>
+              <w:rPr>
+                <w:rFonts w:eastAsia="Calibri" w:cstheme="minorHAnsi"/>
+                <w:sz w:val="28"/>
+                <w:szCs w:val="28"/>
+              </w:rPr>
+              <w:t>70</w:t>
+            </w:r>
+          </w:p>
+        </w:tc>
+        <w:tc>
+          <w:tcPr>
+            <w:tcW w:w="2151" w:type="dxa"/>
+          </w:tcPr>
+          <w:p>
+            <w:pPr>
+              <w:ind w:right="43"/>
+              <w:jc w:val="center"/>
+              <w:rPr>
+                <w:rFonts w:eastAsia="Calibri" w:cstheme="minorHAnsi"/>
+                <w:sz w:val="28"/>
+                <w:szCs w:val="28"/>
+              </w:rPr>
+            </w:pPr>
+            <w:r>
+              <w:rPr>
+                <w:rFonts w:eastAsia="Calibri" w:cstheme="minorHAnsi"/>
+                <w:sz w:val="28"/>
+                <w:szCs w:val="28"/>
+              </w:rPr>
+              <w:t>40.67</w:t>
+            </w:r>
+          </w:p>
+        </w:tc>
+      </w:tr>
+      <w:tr>
+        <w:trPr>
+          <w:trHeight w:val="290"/>
+          <w:jc w:val="center"/>
+        </w:trPr>
+        <w:tc>
+          <w:tcPr>
+            <w:tcW w:w="2046" w:type="dxa"/>
+          </w:tcPr>
+          <w:p>
+            <w:pPr>
+              <w:ind w:right="44"/>
+              <w:jc w:val="center"/>
+              <w:rPr>
+                <w:rFonts w:eastAsia="Calibri" w:cstheme="minorHAnsi"/>
+                <w:sz w:val="28"/>
+                <w:szCs w:val="28"/>
+              </w:rPr>
+            </w:pPr>
+            <w:r>
+              <w:rPr>
+                <w:rFonts w:eastAsia="Calibri" w:cstheme="minorHAnsi"/>
+                <w:sz w:val="28"/>
+                <w:szCs w:val="28"/>
+              </w:rPr>
+              <w:t xml:space="preserve">Case </w:t>
+            </w:r>
+            <w:r>
+              <w:rPr>
+                <w:rFonts w:eastAsia="Calibri" w:cstheme="minorHAnsi"/>
+                <w:sz w:val="28"/>
+                <w:szCs w:val="28"/>
+              </w:rPr>
+              <w:t>–</w:t>
+            </w:r>
+            <w:r>
+              <w:rPr>
+                <w:rFonts w:eastAsia="Calibri" w:cstheme="minorHAnsi"/>
+                <w:sz w:val="28"/>
+                <w:szCs w:val="28"/>
+              </w:rPr>
+              <w:t xml:space="preserve"> 2</w:t>
+            </w:r>
+            <w:r>
+              <w:rPr>
+                <w:rFonts w:eastAsia="Calibri" w:cstheme="minorHAnsi"/>
+                <w:sz w:val="28"/>
+                <w:szCs w:val="28"/>
+              </w:rPr>
+              <w:t>4</w:t>
+            </w:r>
+          </w:p>
+        </w:tc>
+        <w:tc>
+          <w:tcPr>
+            <w:tcW w:w="2045" w:type="dxa"/>
+          </w:tcPr>
+          <w:p>
+            <w:pPr>
+              <w:ind w:right="43"/>
+              <w:jc w:val="center"/>
+              <w:rPr>
+                <w:rFonts w:eastAsia="Calibri" w:cstheme="minorHAnsi"/>
+                <w:sz w:val="28"/>
+                <w:szCs w:val="28"/>
+              </w:rPr>
+            </w:pPr>
+            <w:r>
+              <w:rPr>
+                <w:rFonts w:eastAsia="Calibri" w:cstheme="minorHAnsi"/>
+                <w:sz w:val="28"/>
+                <w:szCs w:val="28"/>
+              </w:rPr>
+              <w:t>118</w:t>
+            </w:r>
+          </w:p>
+        </w:tc>
+        <w:tc>
+          <w:tcPr>
+            <w:tcW w:w="2045" w:type="dxa"/>
+          </w:tcPr>
+          <w:p>
+            <w:pPr>
+              <w:ind w:right="44"/>
+              <w:jc w:val="center"/>
+              <w:rPr>
+                <w:rFonts w:eastAsia="Calibri" w:cstheme="minorHAnsi"/>
+                <w:sz w:val="28"/>
+                <w:szCs w:val="28"/>
+              </w:rPr>
+            </w:pPr>
+            <w:r>
+              <w:rPr>
+                <w:rFonts w:eastAsia="Calibri" w:cstheme="minorHAnsi"/>
+                <w:sz w:val="28"/>
+                <w:szCs w:val="28"/>
+              </w:rPr>
+              <w:t>75</w:t>
+            </w:r>
+          </w:p>
+        </w:tc>
+        <w:tc>
+          <w:tcPr>
+            <w:tcW w:w="2151" w:type="dxa"/>
+          </w:tcPr>
+          <w:p>
+            <w:pPr>
+              <w:ind w:right="43"/>
+              <w:jc w:val="center"/>
+              <w:rPr>
+                <w:rFonts w:eastAsia="Calibri" w:cstheme="minorHAnsi"/>
+                <w:sz w:val="28"/>
+                <w:szCs w:val="28"/>
+              </w:rPr>
+            </w:pPr>
+            <w:r>
+              <w:rPr>
+                <w:rFonts w:eastAsia="Calibri" w:cstheme="minorHAnsi"/>
+                <w:sz w:val="28"/>
+                <w:szCs w:val="28"/>
+              </w:rPr>
+              <w:t>36.44</w:t>
+            </w:r>
+          </w:p>
+        </w:tc>
+      </w:tr>
+      <w:tr>
+        <w:trPr>
+          <w:trHeight w:val="290"/>
+          <w:jc w:val="center"/>
+        </w:trPr>
+        <w:tc>
+          <w:tcPr>
+            <w:tcW w:w="2046" w:type="dxa"/>
+          </w:tcPr>
+          <w:p>
+            <w:pPr>
+              <w:ind w:right="44"/>
+              <w:jc w:val="center"/>
+              <w:rPr>
+                <w:rFonts w:eastAsia="Calibri" w:cstheme="minorHAnsi"/>
+                <w:sz w:val="28"/>
+                <w:szCs w:val="28"/>
+              </w:rPr>
+            </w:pPr>
+            <w:r>
+              <w:rPr>
+                <w:rFonts w:eastAsia="Calibri" w:cstheme="minorHAnsi"/>
+                <w:sz w:val="28"/>
+                <w:szCs w:val="28"/>
+              </w:rPr>
+              <w:t xml:space="preserve">Case </w:t>
+            </w:r>
+            <w:r>
+              <w:rPr>
+                <w:rFonts w:eastAsia="Calibri" w:cstheme="minorHAnsi"/>
+                <w:sz w:val="28"/>
+                <w:szCs w:val="28"/>
+              </w:rPr>
+              <w:t>–</w:t>
+            </w:r>
+            <w:r>
+              <w:rPr>
+                <w:rFonts w:eastAsia="Calibri" w:cstheme="minorHAnsi"/>
+                <w:sz w:val="28"/>
+                <w:szCs w:val="28"/>
+              </w:rPr>
+              <w:t xml:space="preserve"> 2</w:t>
+            </w:r>
+            <w:r>
+              <w:rPr>
+                <w:rFonts w:eastAsia="Calibri" w:cstheme="minorHAnsi"/>
+                <w:sz w:val="28"/>
+                <w:szCs w:val="28"/>
+              </w:rPr>
+              <w:t>5</w:t>
+            </w:r>
+          </w:p>
+        </w:tc>
+        <w:tc>
+          <w:tcPr>
+            <w:tcW w:w="2045" w:type="dxa"/>
+          </w:tcPr>
+          <w:p>
+            <w:pPr>
+              <w:ind w:right="43"/>
+              <w:jc w:val="center"/>
+              <w:rPr>
+                <w:rFonts w:eastAsia="Calibri" w:cstheme="minorHAnsi"/>
+                <w:sz w:val="28"/>
+                <w:szCs w:val="28"/>
+              </w:rPr>
+            </w:pPr>
+            <w:r>
+              <w:rPr>
+                <w:rFonts w:eastAsia="Calibri" w:cstheme="minorHAnsi"/>
+                <w:sz w:val="28"/>
+                <w:szCs w:val="28"/>
+              </w:rPr>
+              <w:t>118</w:t>
+            </w:r>
+          </w:p>
+        </w:tc>
+        <w:tc>
+          <w:tcPr>
+            <w:tcW w:w="2045" w:type="dxa"/>
+          </w:tcPr>
+          <w:p>
+            <w:pPr>
+              <w:ind w:right="44"/>
+              <w:jc w:val="center"/>
+              <w:rPr>
+                <w:rFonts w:eastAsia="Calibri" w:cstheme="minorHAnsi"/>
+                <w:sz w:val="28"/>
+                <w:szCs w:val="28"/>
+              </w:rPr>
+            </w:pPr>
+            <w:r>
+              <w:rPr>
+                <w:rFonts w:eastAsia="Calibri" w:cstheme="minorHAnsi"/>
+                <w:sz w:val="28"/>
+                <w:szCs w:val="28"/>
+              </w:rPr>
+              <w:t>76</w:t>
+            </w:r>
+          </w:p>
+        </w:tc>
+        <w:tc>
+          <w:tcPr>
+            <w:tcW w:w="2151" w:type="dxa"/>
+          </w:tcPr>
+          <w:p>
+            <w:pPr>
+              <w:ind w:right="43"/>
+              <w:jc w:val="center"/>
+              <w:rPr>
+                <w:rFonts w:eastAsia="Calibri" w:cstheme="minorHAnsi"/>
+                <w:sz w:val="28"/>
+                <w:szCs w:val="28"/>
+              </w:rPr>
+            </w:pPr>
+            <w:r>
+              <w:rPr>
+                <w:rFonts w:eastAsia="Calibri" w:cstheme="minorHAnsi"/>
+                <w:sz w:val="28"/>
+                <w:szCs w:val="28"/>
+              </w:rPr>
+              <w:t>35.59</w:t>
             </w:r>
           </w:p>
         </w:tc>
@@ -2955,7 +3729,15 @@
                 <w:sz w:val="28"/>
                 <w:szCs w:val="28"/>
               </w:rPr>
-              <w:t>Avg = 126</w:t>
+              <w:t>Avg = 1</w:t>
+            </w:r>
+            <w:r>
+              <w:rPr>
+                <w:rFonts w:eastAsia="Calibri" w:cstheme="minorHAnsi"/>
+                <w:sz w:val="28"/>
+                <w:szCs w:val="28"/>
+              </w:rPr>
+              <w:t>18</w:t>
             </w:r>
           </w:p>
         </w:tc>
@@ -2988,7 +3770,7 @@
                 <w:sz w:val="28"/>
                 <w:szCs w:val="28"/>
               </w:rPr>
-              <w:t>86</w:t>
+              <w:t>71.48</w:t>
             </w:r>
           </w:p>
         </w:tc>
@@ -3021,13 +3803,12 @@
                 <w:sz w:val="28"/>
                 <w:szCs w:val="28"/>
               </w:rPr>
-              <w:t>31.75</w:t>
+              <w:t>40.27</w:t>
             </w:r>
           </w:p>
         </w:tc>
       </w:tr>
     </w:tbl>
-    <w:p/>
     <w:p/>
     <w:p/>
     <w:p>
@@ -3148,8 +3929,8 @@
     <w:p>
       <w:pPr>
         <w:rPr>
-          <w:rFonts w:eastAsiaTheme="minorEastAsia"/>
           <w:b/>
+          <w:bCs/>
           <w:sz w:val="32"/>
           <w:szCs w:val="32"/>
         </w:rPr>
@@ -3160,57 +3941,18 @@
         <w:rPr>
           <w:b/>
           <w:bCs/>
-          <w:sz w:val="32"/>
-          <w:szCs w:val="32"/>
+          <w:sz w:val="28"/>
+          <w:szCs w:val="28"/>
         </w:rPr>
       </w:pPr>
-    </w:p>
-    <w:p>
-      <w:pPr>
+      <w:r>
         <w:rPr>
           <w:b/>
           <w:bCs/>
-          <w:sz w:val="32"/>
-          <w:szCs w:val="32"/>
-        </w:rPr>
-      </w:pPr>
-    </w:p>
-    <w:p>
-      <w:pPr>
-        <w:rPr>
-          <w:b/>
-          <w:bCs/>
-          <w:sz w:val="32"/>
-          <w:szCs w:val="32"/>
-        </w:rPr>
-      </w:pPr>
-    </w:p>
-    <w:p>
-      <w:pPr>
-        <w:rPr>
-          <w:b/>
-          <w:bCs/>
-          <w:sz w:val="32"/>
-          <w:szCs w:val="32"/>
-        </w:rPr>
-      </w:pPr>
-    </w:p>
-    <w:p>
-      <w:pPr>
-        <w:rPr>
-          <w:b/>
-          <w:bCs/>
-          <w:sz w:val="28"/>
-          <w:szCs w:val="28"/>
-        </w:rPr>
-      </w:pPr>
-      <w:r>
-        <w:rPr>
-          <w:b/>
-          <w:bCs/>
-          <w:sz w:val="28"/>
-          <w:szCs w:val="28"/>
-        </w:rPr>
+          <w:sz w:val="28"/>
+          <w:szCs w:val="28"/>
+        </w:rPr>
+        <w:lastRenderedPageBreak/>
         <w:t xml:space="preserve">Graphs : </w:t>
       </w:r>
     </w:p>
@@ -3234,7 +3976,7 @@
           <w:noProof/>
         </w:rPr>
         <w:drawing>
-          <wp:inline distT="0" distB="0" distL="0" distR="0" wp14:anchorId="673585F7" wp14:editId="1D756BC3">
+          <wp:inline distT="0" distB="0" distL="0" distR="0" wp14:anchorId="673585F7" wp14:editId="21A7E994">
             <wp:extent cx="6786411" cy="3556635"/>
             <wp:effectExtent l="0" t="0" r="14605" b="5715"/>
             <wp:docPr id="912928840" name="Chart 1">
@@ -3313,6 +4055,7 @@
         <w:rPr>
           <w:noProof/>
         </w:rPr>
+        <w:lastRenderedPageBreak/>
         <w:drawing>
           <wp:inline distT="0" distB="0" distL="0" distR="0" wp14:anchorId="26A49466" wp14:editId="34F50EFD">
             <wp:extent cx="6645910" cy="3588888"/>
@@ -4497,6 +5240,66 @@
           </c:spPr>
           <c:invertIfNegative val="0"/>
           <c:dLbls>
+            <c:dLbl>
+              <c:idx val="0"/>
+              <c:tx>
+                <c:rich>
+                  <a:bodyPr/>
+                  <a:lstStyle/>
+                  <a:p>
+                    <a:r>
+                      <a:rPr lang="en-US"/>
+                      <a:t>118</a:t>
+                    </a:r>
+                  </a:p>
+                </c:rich>
+              </c:tx>
+              <c:dLblPos val="outEnd"/>
+              <c:showLegendKey val="0"/>
+              <c:showVal val="1"/>
+              <c:showCatName val="0"/>
+              <c:showSerName val="0"/>
+              <c:showPercent val="0"/>
+              <c:showBubbleSize val="0"/>
+              <c:extLst>
+                <c:ext xmlns:c15="http://schemas.microsoft.com/office/drawing/2012/chart" uri="{CE6537A1-D6FC-4f65-9D91-7224C49458BB}">
+                  <c15:showDataLabelsRange val="0"/>
+                </c:ext>
+                <c:ext xmlns:c16="http://schemas.microsoft.com/office/drawing/2014/chart" uri="{C3380CC4-5D6E-409C-BE32-E72D297353CC}">
+                  <c16:uniqueId val="{00000000-89AA-4796-93E1-6368D9A97528}"/>
+                </c:ext>
+              </c:extLst>
+            </c:dLbl>
+            <c:dLbl>
+              <c:idx val="1"/>
+              <c:tx>
+                <c:rich>
+                  <a:bodyPr/>
+                  <a:lstStyle/>
+                  <a:p>
+                    <a:r>
+                      <a:rPr lang="en-US"/>
+                      <a:t>118</a:t>
+                    </a:r>
+                  </a:p>
+                </c:rich>
+              </c:tx>
+              <c:dLblPos val="outEnd"/>
+              <c:showLegendKey val="0"/>
+              <c:showVal val="1"/>
+              <c:showCatName val="0"/>
+              <c:showSerName val="0"/>
+              <c:showPercent val="0"/>
+              <c:showBubbleSize val="0"/>
+              <c:extLst>
+                <c:ext xmlns:c15="http://schemas.microsoft.com/office/drawing/2012/chart" uri="{CE6537A1-D6FC-4f65-9D91-7224C49458BB}">
+                  <c15:showDataLabelsRange val="0"/>
+                </c:ext>
+                <c:ext xmlns:c16="http://schemas.microsoft.com/office/drawing/2014/chart" uri="{C3380CC4-5D6E-409C-BE32-E72D297353CC}">
+                  <c16:uniqueId val="{00000001-89AA-4796-93E1-6368D9A97528}"/>
+                </c:ext>
+              </c:extLst>
+            </c:dLbl>
             <c:spPr>
               <a:noFill/>
               <a:ln>

</xml_diff>